<commit_message>
Double-anonymize all reviewer-facing files per CAG Guide for Authors: remove author block from manuscript and marked version, anonymize response letter signature, add four Jiangsu grant acknowledgements to the separate title page only; rebuild and sync submission_0907 (title page 1p, manuscript 15p, merged 22p)
</commit_message>
<xml_diff>
--- a/final/submission_0907/response to comments of reviewers 0907.docx
+++ b/final/submission_0907/response to comments of reviewers 0907.docx
@@ -97,15 +97,15 @@
         <w:pStyle w:val="BodyText"/>
       </w:pPr>
       <w:r>
-        <w:t xml:space="preserve">First Author: Xueyuan Che</w:t>
-      </w:r>
-    </w:p>
-    <w:p>
-      <w:pPr>
-        <w:pStyle w:val="BodyText"/>
-      </w:pPr>
-      <w:r>
-        <w:t xml:space="preserve">Corresponding author: Libo Sun (sunlibo@seu.edu.cn)</w:t>
+        <w:t xml:space="preserve">The Authors</w:t>
+      </w:r>
+    </w:p>
+    <w:p>
+      <w:pPr>
+        <w:pStyle w:val="BodyText"/>
+      </w:pPr>
+      <w:r>
+        <w:t xml:space="preserve">(Author identities and acknowledgements are provided on the separately uploaded title page, per the journal’s double-anonymized review process.)</w:t>
       </w:r>
     </w:p>
     <w:p>

</xml_diff>